<commit_message>
fix(resume): address PR review — declarative constants, regex docs, dedupe, Bun.write
- build-resume-template.js: replace inline numerics with declarative SIZE_PT/SPACE_PT/MARGIN/BULLET_INDENT constants + halfPt/twips/eighthPt unit converters; use convertInchesToTwip from docx
- page-count.ts: add comment explaining the ^\\d+$ stdout regex guard
- template-structure.test.ts: extract pgMar match once + loop over 4 sides instead of 4 separate toMatch calls
- validate-links.js: comment confirming path.relative null-safety contract
- build-fixtures.js: switch to Bun.write (Bun-native) + docstring clarifying node:path runs via Bun compat layer
</commit_message>
<xml_diff>
--- a/references/resume-template.docx
+++ b/references/resume-template.docx
@@ -184,7 +184,7 @@
       <w:lvlText w:val="•"/>
       <w:lvlJc w:val="left"/>
       <w:pPr>
-        <w:ind w:left="216" w:hanging="216"/>
+        <w:ind w:left="215" w:hanging="215"/>
       </w:pPr>
     </w:lvl>
   </w:abstractNum>
@@ -320,7 +320,7 @@
     <w:qFormat/>
     <w:pPr>
       <w:spacing w:after="40" w:before="40" w:line="240"/>
-      <w:ind w:left="216" w:hanging="216"/>
+      <w:ind w:left="215" w:hanging="215"/>
     </w:pPr>
     <w:rPr>
       <w:rFonts w:ascii="Calibri" w:cs="Calibri" w:eastAsia="Calibri" w:hAnsi="Calibri"/>
@@ -473,7 +473,7 @@
         <w:numId w:val="2"/>
       </w:numPr>
       <w:spacing w:after="40" w:before="40" w:line="240"/>
-      <w:ind w:left="216" w:hanging="216"/>
+      <w:ind w:left="215" w:hanging="215"/>
     </w:pPr>
     <w:rPr>
       <w:rFonts w:ascii="Calibri" w:cs="Calibri" w:eastAsia="Calibri" w:hAnsi="Calibri"/>
@@ -507,7 +507,7 @@
         <w:numId w:val="2"/>
       </w:numPr>
       <w:spacing w:after="40" w:before="40"/>
-      <w:ind w:left="216" w:hanging="216"/>
+      <w:ind w:left="215" w:hanging="215"/>
     </w:pPr>
     <w:rPr>
       <w:rFonts w:ascii="Calibri" w:cs="Calibri" w:eastAsia="Calibri" w:hAnsi="Calibri"/>

</xml_diff>